<commit_message>
Upgrade Tutorial 1 notes to teaching-focused version
</commit_message>
<xml_diff>
--- a/School/CloudSecurity/Notes/CloudSecurity_Tutorial1_解題筆記_雙語.docx
+++ b/School/CloudSecurity/Notes/CloudSecurity_Tutorial1_解題筆記_雙語.docx
@@ -11,7 +11,7 @@
           <w:b/>
           <w:sz w:val="36"/>
         </w:rPr>
-        <w:t>Cloud Security Tutorial 1</w:t>
+        <w:t>Cloud Security Tutorial 1 — 教學版筆記（雙語）</w:t>
       </w:r>
     </w:p>
     <w:p>
@@ -21,9 +21,9 @@
       <w:r>
         <w:rPr>
           <w:b/>
-          <w:sz w:val="26"/>
+          <w:sz w:val="24"/>
         </w:rPr>
-        <w:t>INTE2401/2402/2691 — 解題筆記（雙語）</w:t>
+        <w:t>INTE2401/2402/2691</w:t>
       </w:r>
     </w:p>
     <w:p>
@@ -31,7 +31,7 @@
         <w:jc w:val="center"/>
       </w:pPr>
       <w:r>
-        <w:t>2026-03-03</w:t>
+        <w:t>Updated: 2026-03-03</w:t>
       </w:r>
     </w:p>
     <w:p/>
@@ -40,23 +40,37 @@
         <w:pStyle w:val="Heading1"/>
       </w:pPr>
       <w:r>
-        <w:t>使用方式 / How to use</w:t>
+        <w:t>怎麼用這份筆記 / How to study with this note</w:t>
       </w:r>
     </w:p>
     <w:p>
-      <w:pPr>
-        <w:pStyle w:val="ListBullet"/>
-      </w:pPr>
       <w:r>
-        <w:t>這份文件是「學習/作業輔助」：給你每題的觀念、正確選項與理由（避免只背答案）。</w:t>
+        <w:t>• 先讀每題的「核心概念」再看答案：你會記得更久。</w:t>
       </w:r>
     </w:p>
     <w:p>
-      <w:pPr>
-        <w:pStyle w:val="ListBullet"/>
-      </w:pPr>
       <w:r>
-        <w:t>This is a study aid: each question includes the correct choice and a short justification.</w:t>
+        <w:t>• Read the “core concept” first, then check the answer.</w:t>
+      </w:r>
+    </w:p>
+    <w:p>
+      <w:r>
+        <w:t>• 每題都問自己：這題在考 SaaS/PaaS/IaaS 的責任邊界？還是 CIA / security services？</w:t>
+      </w:r>
+    </w:p>
+    <w:p>
+      <w:r>
+        <w:t>• Ask: is it testing cloud models (shared responsibility) or CIA/security services?</w:t>
+      </w:r>
+    </w:p>
+    <w:p>
+      <w:r>
+        <w:t>• 計算題先自己做一遍，再對照我的步驟。</w:t>
+      </w:r>
+    </w:p>
+    <w:p>
+      <w:r>
+        <w:t>• For computation, do it once yourself, then compare steps.</w:t>
       </w:r>
     </w:p>
     <w:p>
@@ -64,7 +78,7 @@
         <w:pStyle w:val="Heading1"/>
       </w:pPr>
       <w:r>
-        <w:t>1) Multiple Choice（選擇題）</w:t>
+        <w:t>1) Multiple Choice（選擇題）— 教學版</w:t>
       </w:r>
     </w:p>
     <w:p>
@@ -77,12 +91,12 @@
     </w:p>
     <w:p>
       <w:r>
-        <w:t>Q1. Which service model provides users with a web-based email service?</w:t>
+        <w:t>Which service model is an example of a cloud computing environment that provides users with a web based email service?</w:t>
       </w:r>
     </w:p>
     <w:p>
       <w:r>
-        <w:t>題目：提供「網頁版 Email」的雲端服務模型是？</w:t>
+        <w:t>提供「網頁版 Email」的雲端服務模型是？</w:t>
       </w:r>
     </w:p>
     <w:p>
@@ -90,7 +104,7 @@
         <w:pStyle w:val="ListBullet"/>
       </w:pPr>
       <w:r>
-        <w:t>Answer: A. SaaS (Software as a Service)</w:t>
+        <w:t>Answer / 答案：A. SaaS (Software as a Service)</w:t>
       </w:r>
     </w:p>
     <w:p>
@@ -98,7 +112,33 @@
         <w:pStyle w:val="ListBullet"/>
       </w:pPr>
       <w:r>
-        <w:t>理由：使用者直接使用雲端提供的「完整應用程式」；Email 服務（如 Gmail）屬於 SaaS。</w:t>
+        <w:t>Core concept / 核心概念：SaaS = 直接使用雲端提供的完整應用（application）。</w:t>
+      </w:r>
+    </w:p>
+    <w:p>
+      <w:pPr>
+        <w:pStyle w:val="ListBullet"/>
+      </w:pPr>
+      <w:r>
+        <w:t>Why / 為什麼：Web email (Gmail/Outlook Web) 是「應用程式」層服務，使用者不管 OS/平台。</w:t>
+      </w:r>
+    </w:p>
+    <w:p>
+      <w:pPr>
+        <w:pStyle w:val="ListBullet"/>
+      </w:pPr>
+      <w:r>
+        <w:t>Common confusions / 常見誤解：</w:t>
+      </w:r>
+    </w:p>
+    <w:p>
+      <w:r>
+        <w:t>- B PaaS: PaaS 是給你部署應用的平台（runtime/DB/SDK），不是直接給你用一個 email app。</w:t>
+      </w:r>
+    </w:p>
+    <w:p>
+      <w:r>
+        <w:t>- D IaaS: IaaS 給 VM/網路/磁碟，你要自己裝 mail server 才會變成 email 服務。</w:t>
       </w:r>
     </w:p>
     <w:p>
@@ -111,12 +151,12 @@
     </w:p>
     <w:p>
       <w:r>
-        <w:t>Q2. Which service model provides users access to virtual machines?</w:t>
+        <w:t>Which service model provides users access to virtual machines?</w:t>
       </w:r>
     </w:p>
     <w:p>
       <w:r>
-        <w:t>題目：提供使用者「虛擬機（VM）」存取的服務模型是？</w:t>
+        <w:t>提供使用者「虛擬機（VM）」存取的服務模型是？</w:t>
       </w:r>
     </w:p>
     <w:p>
@@ -124,7 +164,7 @@
         <w:pStyle w:val="ListBullet"/>
       </w:pPr>
       <w:r>
-        <w:t>Answer: D. IaaS (Infrastructure as a Service)</w:t>
+        <w:t>Answer / 答案：D. IaaS (Infrastructure as a Service)</w:t>
       </w:r>
     </w:p>
     <w:p>
@@ -132,7 +172,28 @@
         <w:pStyle w:val="ListBullet"/>
       </w:pPr>
       <w:r>
-        <w:t>理由：IaaS 提供運算/儲存/網路等基礎資源，最典型就是 VM（例如 AWS EC2）。</w:t>
+        <w:t>Core concept / 核心概念：IaaS = 基礎設施（VM/網路/儲存）。</w:t>
+      </w:r>
+    </w:p>
+    <w:p>
+      <w:pPr>
+        <w:pStyle w:val="ListBullet"/>
+      </w:pPr>
+      <w:r>
+        <w:t>Why / 為什麼：典型例子是 AWS EC2 / Azure VM：你拿到的是一台 VM。</w:t>
+      </w:r>
+    </w:p>
+    <w:p>
+      <w:pPr>
+        <w:pStyle w:val="ListBullet"/>
+      </w:pPr>
+      <w:r>
+        <w:t>Common confusions / 常見誤解：</w:t>
+      </w:r>
+    </w:p>
+    <w:p>
+      <w:r>
+        <w:t>- A PaaS: PaaS 你拿到的是平台，不一定能碰到 VM。</w:t>
       </w:r>
     </w:p>
     <w:p>
@@ -145,12 +206,12 @@
     </w:p>
     <w:p>
       <w:r>
-        <w:t>Q3. How do users access SaaS services?</w:t>
+        <w:t>How do users access Software as a Service cloud services?</w:t>
       </w:r>
     </w:p>
     <w:p>
       <w:r>
-        <w:t>題目：使用者通常用什麼方式存取 SaaS？</w:t>
+        <w:t>使用者通常用什麼方式存取 SaaS？</w:t>
       </w:r>
     </w:p>
     <w:p>
@@ -158,7 +219,7 @@
         <w:pStyle w:val="ListBullet"/>
       </w:pPr>
       <w:r>
-        <w:t>Answer: C. Web browser</w:t>
+        <w:t>Answer / 答案：C. Web browser</w:t>
       </w:r>
     </w:p>
     <w:p>
@@ -166,7 +227,28 @@
         <w:pStyle w:val="ListBullet"/>
       </w:pPr>
       <w:r>
-        <w:t>理由：SaaS 多以瀏覽器或輕量 App 存取，但考點通常是「瀏覽器」。</w:t>
+        <w:t>Core concept / 核心概念：SaaS 最常見入口 = browser（或輕量 app）。</w:t>
+      </w:r>
+    </w:p>
+    <w:p>
+      <w:pPr>
+        <w:pStyle w:val="ListBullet"/>
+      </w:pPr>
+      <w:r>
+        <w:t>Why / 為什麼：題目強調 web-based；考點就是瀏覽器。</w:t>
+      </w:r>
+    </w:p>
+    <w:p>
+      <w:pPr>
+        <w:pStyle w:val="ListBullet"/>
+      </w:pPr>
+      <w:r>
+        <w:t>Common confusions / 常見誤解：</w:t>
+      </w:r>
+    </w:p>
+    <w:p>
+      <w:r>
+        <w:t>- A Thick client: thick client 是裝在本機的重客戶端，不是 SaaS 的典型描述。</w:t>
       </w:r>
     </w:p>
     <w:p>
@@ -179,12 +261,12 @@
     </w:p>
     <w:p>
       <w:r>
-        <w:t>Q4. What is a hypervisor?</w:t>
+        <w:t>What is a hypervisor?</w:t>
       </w:r>
     </w:p>
     <w:p>
       <w:r>
-        <w:t>題目：Hypervisor 是什麼？</w:t>
+        <w:t>Hypervisor 是什麼？</w:t>
       </w:r>
     </w:p>
     <w:p>
@@ -192,7 +274,7 @@
         <w:pStyle w:val="ListBullet"/>
       </w:pPr>
       <w:r>
-        <w:t>Answer: B. A virtual machine monitor (VMM)</w:t>
+        <w:t>Answer / 答案：B. A virtual machine monitor (VMM)</w:t>
       </w:r>
     </w:p>
     <w:p>
@@ -200,7 +282,28 @@
         <w:pStyle w:val="ListBullet"/>
       </w:pPr>
       <w:r>
-        <w:t>理由：Hypervisor/VMM 負責建立與執行 VM，提供隔離與資源管理。</w:t>
+        <w:t>Core concept / 核心概念：Hypervisor/VMM = 建立/執行 VM 的層。</w:t>
+      </w:r>
+    </w:p>
+    <w:p>
+      <w:pPr>
+        <w:pStyle w:val="ListBullet"/>
+      </w:pPr>
+      <w:r>
+        <w:t>Why / 為什麼：它負責把硬體資源切分並隔離給不同 VM。</w:t>
+      </w:r>
+    </w:p>
+    <w:p>
+      <w:pPr>
+        <w:pStyle w:val="ListBullet"/>
+      </w:pPr>
+      <w:r>
+        <w:t>Common confusions / 常見誤解：</w:t>
+      </w:r>
+    </w:p>
+    <w:p>
+      <w:r>
+        <w:t>- A: VM ≠ hypervisor；VM 跑在 hypervisor 上。</w:t>
       </w:r>
     </w:p>
     <w:p>
@@ -213,12 +316,12 @@
     </w:p>
     <w:p>
       <w:r>
-        <w:t>Q5. What are Type 1 hypervisors?</w:t>
+        <w:t>What are Type 1 hypervisors?</w:t>
       </w:r>
     </w:p>
     <w:p>
       <w:r>
-        <w:t>題目：Type 1 hypervisor 的特徵是？</w:t>
+        <w:t>Type 1 hypervisor 的特徵是？</w:t>
       </w:r>
     </w:p>
     <w:p>
@@ -226,7 +329,7 @@
         <w:pStyle w:val="ListBullet"/>
       </w:pPr>
       <w:r>
-        <w:t>Answer: A. Runs directly on the system hardware (bare metal)</w:t>
+        <w:t>Answer / 答案：A. Runs directly on the system hardware (bare metal)</w:t>
       </w:r>
     </w:p>
     <w:p>
@@ -234,7 +337,28 @@
         <w:pStyle w:val="ListBullet"/>
       </w:pPr>
       <w:r>
-        <w:t>理由：Type 1 直接跑在硬體上；Type 2 才是跑在 Host OS 上。</w:t>
+        <w:t>Core concept / 核心概念：Type 1 = bare metal；Type 2 = hosted (on OS)。</w:t>
+      </w:r>
+    </w:p>
+    <w:p>
+      <w:pPr>
+        <w:pStyle w:val="ListBullet"/>
+      </w:pPr>
+      <w:r>
+        <w:t>Why / 為什麼：Type 1 少一層 host OS，效能與隔離通常較佳，常見於企業虛擬化。</w:t>
+      </w:r>
+    </w:p>
+    <w:p>
+      <w:pPr>
+        <w:pStyle w:val="ListBullet"/>
+      </w:pPr>
+      <w:r>
+        <w:t>Common confusions / 常見誤解：</w:t>
+      </w:r>
+    </w:p>
+    <w:p>
+      <w:r>
+        <w:t>- B: B 描述的是 Type 2。</w:t>
       </w:r>
     </w:p>
     <w:p>
@@ -247,12 +371,12 @@
     </w:p>
     <w:p>
       <w:r>
-        <w:t>Q6. A virtual machine is composed of …</w:t>
+        <w:t>A virtual machine is composed of</w:t>
       </w:r>
     </w:p>
     <w:p>
       <w:r>
-        <w:t>題目：虛擬機（VM）由哪些部分組成？</w:t>
+        <w:t>虛擬機（VM）由哪些部分組成？</w:t>
       </w:r>
     </w:p>
     <w:p>
@@ -260,7 +384,7 @@
         <w:pStyle w:val="ListBullet"/>
       </w:pPr>
       <w:r>
-        <w:t>Answer: B. Operating system and application</w:t>
+        <w:t>Answer / 答案：B. Operating system and application</w:t>
       </w:r>
     </w:p>
     <w:p>
@@ -268,7 +392,28 @@
         <w:pStyle w:val="ListBullet"/>
       </w:pPr>
       <w:r>
-        <w:t>理由：VM 本身指的是「客體 OS + 應用環境」；硬體與 hypervisor 是底層平台，不算 VM 本體。</w:t>
+        <w:t>Core concept / 核心概念：VM 內容 = guest OS + apps（你在 VM 裡看到的世界）。</w:t>
+      </w:r>
+    </w:p>
+    <w:p>
+      <w:pPr>
+        <w:pStyle w:val="ListBullet"/>
+      </w:pPr>
+      <w:r>
+        <w:t>Why / 為什麼：硬體是底層；hypervisor 是管理層；VM 指客體環境本身。</w:t>
+      </w:r>
+    </w:p>
+    <w:p>
+      <w:pPr>
+        <w:pStyle w:val="ListBullet"/>
+      </w:pPr>
+      <w:r>
+        <w:t>Common confusions / 常見誤解：</w:t>
+      </w:r>
+    </w:p>
+    <w:p>
+      <w:r>
+        <w:t>- A: A 把硬體算進 VM；題目通常把硬體視為底層。</w:t>
       </w:r>
     </w:p>
     <w:p>
@@ -281,12 +426,12 @@
     </w:p>
     <w:p>
       <w:r>
-        <w:t>Q7. Which involves prevention of unauthorized withholding of information?</w:t>
+        <w:t>Which of the following involves prevention of unauthorized withholding of information?</w:t>
       </w:r>
     </w:p>
     <w:p>
       <w:r>
-        <w:t>題目：防止未授權的「阻斷/扣住資訊」屬於哪個安全目標？</w:t>
+        <w:t>防止未授權「阻斷/扣住資訊」屬於哪個目標？</w:t>
       </w:r>
     </w:p>
     <w:p>
@@ -294,7 +439,7 @@
         <w:pStyle w:val="ListBullet"/>
       </w:pPr>
       <w:r>
-        <w:t>Answer: C. Availability</w:t>
+        <w:t>Answer / 答案：C. Availability</w:t>
       </w:r>
     </w:p>
     <w:p>
@@ -302,7 +447,28 @@
         <w:pStyle w:val="ListBullet"/>
       </w:pPr>
       <w:r>
-        <w:t>理由：Availability（可用性）確保授權使用者能取得服務/資訊；被阻斷就是 DoS/不可用。</w:t>
+        <w:t>Core concept / 核心概念：Availability = 服務可用、資訊可取得。</w:t>
+      </w:r>
+    </w:p>
+    <w:p>
+      <w:pPr>
+        <w:pStyle w:val="ListBullet"/>
+      </w:pPr>
+      <w:r>
+        <w:t>Why / 為什麼：被阻斷就是 DoS/不可用，對應可用性。</w:t>
+      </w:r>
+    </w:p>
+    <w:p>
+      <w:pPr>
+        <w:pStyle w:val="ListBullet"/>
+      </w:pPr>
+      <w:r>
+        <w:t>Common confusions / 常見誤解：</w:t>
+      </w:r>
+    </w:p>
+    <w:p>
+      <w:r>
+        <w:t>- A Confidentiality: confidentiality 是不讓人看到，不是防阻斷。</w:t>
       </w:r>
     </w:p>
     <w:p>
@@ -315,12 +481,12 @@
     </w:p>
     <w:p>
       <w:r>
-        <w:t>Q8. Which of the following is an active attack?</w:t>
+        <w:t>Which of the following is active attack?</w:t>
       </w:r>
     </w:p>
     <w:p>
       <w:r>
-        <w:t>題目：哪一項是主動式攻擊（active attack）？</w:t>
+        <w:t>哪一項是主動式攻擊（active attack）？</w:t>
       </w:r>
     </w:p>
     <w:p>
@@ -328,7 +494,7 @@
         <w:pStyle w:val="ListBullet"/>
       </w:pPr>
       <w:r>
-        <w:t>Answer: D. Both B (Modification) and C (Masquerade)</w:t>
+        <w:t>Answer / 答案：D. Both B (Modification) and C (Masquerade)</w:t>
       </w:r>
     </w:p>
     <w:p>
@@ -336,7 +502,28 @@
         <w:pStyle w:val="ListBullet"/>
       </w:pPr>
       <w:r>
-        <w:t>理由：竄改與冒充都會「改變系統狀態或資料」；竊聽通常是被動式（passive）。</w:t>
+        <w:t>Core concept / 核心概念：Active attack 會改變系統狀態/資料；Passive attack 只偷看。</w:t>
+      </w:r>
+    </w:p>
+    <w:p>
+      <w:pPr>
+        <w:pStyle w:val="ListBullet"/>
+      </w:pPr>
+      <w:r>
+        <w:t>Why / 為什麼：Modification/masquerade 都會造成狀態改變；eavesdropping 通常是 passive。</w:t>
+      </w:r>
+    </w:p>
+    <w:p>
+      <w:pPr>
+        <w:pStyle w:val="ListBullet"/>
+      </w:pPr>
+      <w:r>
+        <w:t>Common confusions / 常見誤解：</w:t>
+      </w:r>
+    </w:p>
+    <w:p>
+      <w:r>
+        <w:t>- A Eavesdropping: 大多數情境視為 passive attack。</w:t>
       </w:r>
     </w:p>
     <w:p>
@@ -349,12 +536,12 @@
     </w:p>
     <w:p>
       <w:r>
-        <w:t>Q9. Authentication is needed to prevent …</w:t>
+        <w:t>Authentication is needed to prevent</w:t>
       </w:r>
     </w:p>
     <w:p>
       <w:r>
-        <w:t>題目：認證（authentication）主要用來防止？</w:t>
+        <w:t>認證（authentication）主要用來防止？</w:t>
       </w:r>
     </w:p>
     <w:p>
@@ -362,7 +549,7 @@
         <w:pStyle w:val="ListBullet"/>
       </w:pPr>
       <w:r>
-        <w:t>Answer: B. Impersonation</w:t>
+        <w:t>Answer / 答案：B. Impersonation</w:t>
       </w:r>
     </w:p>
     <w:p>
@@ -370,7 +557,28 @@
         <w:pStyle w:val="ListBullet"/>
       </w:pPr>
       <w:r>
-        <w:t>理由：認證確保「你是你」，核心是防冒充/偽裝。</w:t>
+        <w:t>Core concept / 核心概念：Authentication 解決「你是不是你」。</w:t>
+      </w:r>
+    </w:p>
+    <w:p>
+      <w:pPr>
+        <w:pStyle w:val="ListBullet"/>
+      </w:pPr>
+      <w:r>
+        <w:t>Why / 為什麼：防冒充是認證的核心目的。</w:t>
+      </w:r>
+    </w:p>
+    <w:p>
+      <w:pPr>
+        <w:pStyle w:val="ListBullet"/>
+      </w:pPr>
+      <w:r>
+        <w:t>Common confusions / 常見誤解：</w:t>
+      </w:r>
+    </w:p>
+    <w:p>
+      <w:r>
+        <w:t>- A Eavesdropping: 防竊聽主要靠 encryption。</w:t>
       </w:r>
     </w:p>
     <w:p>
@@ -383,12 +591,12 @@
     </w:p>
     <w:p>
       <w:r>
-        <w:t>Q10. In conventional encryption, the encryption key is known to …</w:t>
+        <w:t>In the model of conventional encryption, the encryption key is known to</w:t>
       </w:r>
     </w:p>
     <w:p>
       <w:r>
-        <w:t>題目：在傳統（對稱）加密模型中，金鑰通常誰知道？</w:t>
+        <w:t>在傳統（對稱）加密模型中，金鑰通常誰知道？</w:t>
       </w:r>
     </w:p>
     <w:p>
@@ -396,7 +604,7 @@
         <w:pStyle w:val="ListBullet"/>
       </w:pPr>
       <w:r>
-        <w:t>Answer: D. Both A and B (Sender and Receiver)</w:t>
+        <w:t>Answer / 答案：D. Both A and B (Sender and Receiver)</w:t>
       </w:r>
     </w:p>
     <w:p>
@@ -404,7 +612,28 @@
         <w:pStyle w:val="ListBullet"/>
       </w:pPr>
       <w:r>
-        <w:t>理由：對稱加密同一把 key 用於加/解密，發送者與接收者都需要知道。</w:t>
+        <w:t>Core concept / 核心概念：對稱加密：加/解密共享同一把 key。</w:t>
+      </w:r>
+    </w:p>
+    <w:p>
+      <w:pPr>
+        <w:pStyle w:val="ListBullet"/>
+      </w:pPr>
+      <w:r>
+        <w:t>Why / 為什麼：Sender/Receiver 都要能使用 key；eavesdropper 不應該知道。</w:t>
+      </w:r>
+    </w:p>
+    <w:p>
+      <w:pPr>
+        <w:pStyle w:val="ListBullet"/>
+      </w:pPr>
+      <w:r>
+        <w:t>Common confusions / 常見誤解：</w:t>
+      </w:r>
+    </w:p>
+    <w:p>
+      <w:r>
+        <w:t>- C Eavesdropper: 如果 eavesdropper 知道 key，就失去機密性。</w:t>
       </w:r>
     </w:p>
     <w:p>
@@ -412,7 +641,7 @@
         <w:pStyle w:val="Heading1"/>
       </w:pPr>
       <w:r>
-        <w:t>2) Computational（計算題）</w:t>
+        <w:t>2) Computational（計算題）— 教學版</w:t>
       </w:r>
     </w:p>
     <w:p>
@@ -420,12 +649,7 @@
         <w:pStyle w:val="Heading2"/>
       </w:pPr>
       <w:r>
-        <w:t>Q1. Encrypt PASSWORD with shift cipher, key=6</w:t>
-      </w:r>
-    </w:p>
-    <w:p>
-      <w:r>
-        <w:t>Rule / 規則：將每個字母往後移 6（A→G）。</w:t>
+        <w:t>Shift cipher 通用公式 / General formula</w:t>
       </w:r>
     </w:p>
     <w:p>
@@ -433,7 +657,7 @@
         <w:pStyle w:val="ListBullet"/>
       </w:pPr>
       <w:r>
-        <w:t>PASSWORD → VGYYCUXJ</w:t>
+        <w:t>English: map A..Z to 0..25. Encrypt: C = (P + k) mod 26. Decrypt: P = (C - k) mod 26.</w:t>
       </w:r>
     </w:p>
     <w:p>
@@ -441,7 +665,7 @@
         <w:pStyle w:val="ListBullet"/>
       </w:pPr>
       <w:r>
-        <w:t>Check / 檢查：P→V, A→G, S→Y, S→Y, W→C, O→U, R→X, D→J</w:t>
+        <w:t>中文：先把 A..Z 映射為 0..25。加密：密文 = (明文 + k) mod 26；解密：明文 = (密文 - k) mod 26。</w:t>
       </w:r>
     </w:p>
     <w:p>
@@ -449,28 +673,65 @@
         <w:pStyle w:val="Heading2"/>
       </w:pPr>
       <w:r>
-        <w:t>Q2. Decrypt GSQIFEGO and find the key (shift cipher)</w:t>
+        <w:t>Q1. Encrypt PASSWORD with key=6</w:t>
       </w:r>
     </w:p>
     <w:p>
       <w:r>
-        <w:t>Method / 方法：嘗試位移；或用「明文常見字」推回 key。</w:t>
+        <w:t>• Step 1: Write the plaintext in uppercase: PASSWORD</w:t>
+      </w:r>
+    </w:p>
+    <w:p>
+      <w:r>
+        <w:t>• 步驟1：先把明文統一成大寫：PASSWORD</w:t>
+      </w:r>
+    </w:p>
+    <w:p>
+      <w:r>
+        <w:t>• Step 2: Shift each letter forward by 6 (wrap around after Z).</w:t>
+      </w:r>
+    </w:p>
+    <w:p>
+      <w:r>
+        <w:t>• 步驟2：每個字母往後移 6（超過 Z 就回到 A）。</w:t>
+      </w:r>
+    </w:p>
+    <w:p>
+      <w:r>
+        <w:t>• Result: VGYYCUXJ</w:t>
+      </w:r>
+    </w:p>
+    <w:p>
+      <w:r>
+        <w:t>• 結果：VGYYCUXJ</w:t>
       </w:r>
     </w:p>
     <w:p>
       <w:pPr>
-        <w:pStyle w:val="ListBullet"/>
+        <w:pStyle w:val="Heading2"/>
       </w:pPr>
       <w:r>
-        <w:t>One valid solution: key = 4, plaintext = COMEBACK</w:t>
+        <w:t>Q2. Decrypt GSQIFEGO and find key</w:t>
       </w:r>
     </w:p>
     <w:p>
-      <w:pPr>
-        <w:pStyle w:val="ListBullet"/>
-      </w:pPr>
       <w:r>
-        <w:t>Reason / 理由：G→C 代表往回移 4；套用後得到 COMEBACK。</w:t>
+        <w:t>• Idea: try to guess a meaningful plaintext. If G becomes C, key is 4 (because G→C is -4).</w:t>
+      </w:r>
+    </w:p>
+    <w:p>
+      <w:r>
+        <w:t>• 概念：找一個有意義的明文。若 G 解回 C，代表 key=4（G→C 往回移 4）。</w:t>
+      </w:r>
+    </w:p>
+    <w:p>
+      <w:r>
+        <w:t>• Apply key=4 to all letters: GSQIFEGO → COMEBACK</w:t>
+      </w:r>
+    </w:p>
+    <w:p>
+      <w:r>
+        <w:t>• 套用 key=4：GSQIFEGO → COMEBACK</w:t>
       </w:r>
     </w:p>
     <w:p>
@@ -478,20 +739,91 @@
         <w:pStyle w:val="Heading1"/>
       </w:pPr>
       <w:r>
-        <w:t>3) Programming（HTML + JavaScript）</w:t>
+        <w:t>3) Programming（HTML + JavaScript）— 教學版</w:t>
+      </w:r>
+    </w:p>
+    <w:p>
+      <w:pPr>
+        <w:pStyle w:val="Heading2"/>
+      </w:pPr>
+      <w:r>
+        <w:t>你要做的功能 / What you are building</w:t>
       </w:r>
     </w:p>
     <w:p>
       <w:r>
-        <w:t>Goal / 目標：做一個 Caesar cipher（key=3）的小網頁：輸入明文 → 輸出密文。</w:t>
+        <w:t>• Input box + button; read plaintext; output ciphertext (Caesar, key=3).</w:t>
+      </w:r>
+    </w:p>
+    <w:p>
+      <w:r>
+        <w:t>• 輸入框 + 按鈕；讀取明文；輸出密文（凱撒加密，key=3）。</w:t>
       </w:r>
     </w:p>
     <w:p>
       <w:pPr>
-        <w:pStyle w:val="ListBullet"/>
+        <w:pStyle w:val="Heading2"/>
       </w:pPr>
       <w:r>
-        <w:t>Starter template / 範本：</w:t>
+        <w:t>思路拆解 / Step-by-step reasoning</w:t>
+      </w:r>
+    </w:p>
+    <w:p>
+      <w:r>
+        <w:t>• 1) Get input value (DOM)</w:t>
+      </w:r>
+    </w:p>
+    <w:p>
+      <w:r>
+        <w:t>• 1) 取得輸入框文字（DOM）</w:t>
+      </w:r>
+    </w:p>
+    <w:p>
+      <w:r>
+        <w:t>• 2) Loop through characters</w:t>
+      </w:r>
+    </w:p>
+    <w:p>
+      <w:r>
+        <w:t>• 2) 逐字元迴圈處理</w:t>
+      </w:r>
+    </w:p>
+    <w:p>
+      <w:r>
+        <w:t>• 3) If letter: shift within A–Z or a–z</w:t>
+      </w:r>
+    </w:p>
+    <w:p>
+      <w:r>
+        <w:t>• 3) 如果是字母：在 A–Z 或 a–z 範圍內做位移</w:t>
+      </w:r>
+    </w:p>
+    <w:p>
+      <w:r>
+        <w:t>• 4) Else: keep as-is (space/punctuation)</w:t>
+      </w:r>
+    </w:p>
+    <w:p>
+      <w:r>
+        <w:t>• 4) 其他字元：原樣保留（空白/標點）</w:t>
+      </w:r>
+    </w:p>
+    <w:p>
+      <w:r>
+        <w:t>• 5) Show result in the page</w:t>
+      </w:r>
+    </w:p>
+    <w:p>
+      <w:r>
+        <w:t>• 5) 把結果顯示在頁面上</w:t>
+      </w:r>
+    </w:p>
+    <w:p>
+      <w:pPr>
+        <w:pStyle w:val="Heading2"/>
+      </w:pPr>
+      <w:r>
+        <w:t>可直接用的範本 / Copy-paste starter</w:t>
       </w:r>
     </w:p>
     <w:p>
@@ -543,8 +875,6 @@
         <w:t xml:space="preserve">        const ch = plain[i];</w:t>
         <w:br/>
         <w:br/>
-        <w:t xml:space="preserve">        // Handle A-Z</w:t>
-        <w:br/>
         <w:t xml:space="preserve">        if (ch &gt;= 'A' &amp;&amp; ch &lt;= 'Z') {</w:t>
         <w:br/>
         <w:t xml:space="preserve">          const base = 'A'.charCodeAt(0);</w:t>
@@ -553,11 +883,7 @@
         <w:br/>
         <w:t xml:space="preserve">          out += String.fromCharCode(base + (code + key) % 26);</w:t>
         <w:br/>
-        <w:t xml:space="preserve">        }</w:t>
-        <w:br/>
-        <w:t xml:space="preserve">        // Handle a-z</w:t>
-        <w:br/>
-        <w:t xml:space="preserve">        else if (ch &gt;= 'a' &amp;&amp; ch &lt;= 'z') {</w:t>
+        <w:t xml:space="preserve">        } else if (ch &gt;= 'a' &amp;&amp; ch &lt;= 'z') {</w:t>
         <w:br/>
         <w:t xml:space="preserve">          const base = 'a'.charCodeAt(0);</w:t>
         <w:br/>
@@ -565,11 +891,7 @@
         <w:br/>
         <w:t xml:space="preserve">          out += String.fromCharCode(base + (code + key) % 26);</w:t>
         <w:br/>
-        <w:t xml:space="preserve">        }</w:t>
-        <w:br/>
-        <w:t xml:space="preserve">        // Keep non-letters unchanged (spaces, punctuation)</w:t>
-        <w:br/>
-        <w:t xml:space="preserve">        else {</w:t>
+        <w:t xml:space="preserve">        } else {</w:t>
         <w:br/>
         <w:t xml:space="preserve">          out += ch;</w:t>
         <w:br/>
@@ -595,37 +917,27 @@
         <w:pStyle w:val="Heading1"/>
       </w:pPr>
       <w:r>
-        <w:t>常見易錯點 / Common pitfalls</w:t>
+        <w:t>自我檢查題 / Self-check</w:t>
       </w:r>
     </w:p>
     <w:p>
       <w:r>
-        <w:t>- Forgetting wrap-around (Z should go back to A).</w:t>
+        <w:t>• If plaintext is 'xyz', ciphertext should be 'abc' (wrap-around).</w:t>
       </w:r>
     </w:p>
     <w:p>
       <w:r>
-        <w:t>- 忘記循環（Z 要回到 A）。</w:t>
+        <w:t>• 如果輸入 'xyz'，輸出應該是 'abc'（檢查是否有循環）。</w:t>
       </w:r>
     </w:p>
     <w:p>
       <w:r>
-        <w:t>- Only handling uppercase; need both uppercase and lowercase.</w:t>
+        <w:t>• If plaintext contains spaces: 'hello world' → space must remain.</w:t>
       </w:r>
     </w:p>
     <w:p>
       <w:r>
-        <w:t>- 只處理大寫，沒處理小寫。</w:t>
-      </w:r>
-    </w:p>
-    <w:p>
-      <w:r>
-        <w:t>- Not preserving spaces/punctuation.</w:t>
-      </w:r>
-    </w:p>
-    <w:p>
-      <w:r>
-        <w:t>- 空白/標點沒有原樣保留。</w:t>
+        <w:t>• 如果有空白：'hello world' → 空白要保留。</w:t>
       </w:r>
     </w:p>
     <w:sectPr>

</xml_diff>